<commit_message>
Implement per-question structure (question_slots)
Add slot-based pattern architecture where each section stores per-question details (qnum, type, marks, topic, format, choice, parts) as the source of truth. Slot-authored patterns retain per-question topics, choice conditions, and marks through generation and rendering. Legacy aggregates (questions_count, marks, marks_per_question, question_types) are derived from slots at save time, maintaining backward compatibility with all existing consumers. Includes validator with one-round repair (rejects repairs that delete or devalue slots), per-slot marks/type validation in output, and slot-aware prompt generation. Frontend supports viewing and editing slot details with auto-derived section totals. Pressure-tested on PT-1 English example (9-slot Grammar + 3-slot Literature sections); validator caught teacher arithmetic conflicts (9×1m vs declared 7m) as structure warnings instead of silent paper reshaping.
</commit_message>
<xml_diff>
--- a/core/data/base.docx
+++ b/core/data/base.docx
@@ -31,13 +31,14 @@
           <w:tcBorders>
             <w:top w:val="single" w:sz="12" w:color="000000"/>
             <w:left w:val="single" w:sz="12" w:color="000000"/>
-            <w:bottom w:val="single" w:sz="12" w:color="000000"/>
+            <w:bottom w:val="none"/>
             <w:right w:val="single" w:sz="12" w:color="000000"/>
           </w:tcBorders>
         </w:tcPr>
         <w:p>
           <w:pPr>
             <w:jc w:val="center"/>
+            <w:spacing w:after="0" w:line="240" w:lineRule="auto"/>
           </w:pPr>
           <w:r>
             <w:rPr>
@@ -50,6 +51,7 @@
         <w:p>
           <w:pPr>
             <w:jc w:val="center"/>
+            <w:spacing w:after="0" w:line="240" w:lineRule="auto"/>
           </w:pPr>
           <w:r>
             <w:rPr>
@@ -61,6 +63,7 @@
         <w:p>
           <w:pPr>
             <w:jc w:val="center"/>
+            <w:spacing w:after="0" w:line="240" w:lineRule="auto"/>
           </w:pPr>
           <w:r>
             <w:rPr>
@@ -77,13 +80,20 @@
         <w:tcPr>
           <w:tcW w:type="dxa" w:w="9360"/>
           <w:tcBorders>
-            <w:top w:val="single" w:sz="12" w:color="000000"/>
+            <w:top w:val="none"/>
             <w:left w:val="single" w:sz="12" w:color="000000"/>
             <w:bottom w:val="single" w:sz="12" w:color="000000"/>
             <w:right w:val="single" w:sz="12" w:color="000000"/>
           </w:tcBorders>
         </w:tcPr>
-        <w:p/>
+        <w:p>
+          <w:pPr>
+            <w:spacing w:before="0" w:after="0" w:line="240" w:lineRule="auto"/>
+            <w:rPr>
+              <w:sz w:val="12"/>
+            </w:rPr>
+          </w:pPr>
+        </w:p>
         <w:tbl>
           <w:tblPr>
             <w:tblW w:type="auto" w:w="0"/>
@@ -108,6 +118,9 @@
                 </w:tcBorders>
               </w:tcPr>
               <w:p>
+                <w:pPr>
+                  <w:spacing w:after="0" w:line="240" w:lineRule="auto"/>
+                </w:pPr>
                 <w:r>
                   <w:t>CLASS       :</w:t>
                 </w:r>
@@ -128,6 +141,7 @@
               <w:p>
                 <w:pPr>
                   <w:jc w:val="right"/>
+                  <w:spacing w:after="0" w:line="240" w:lineRule="auto"/>
                 </w:pPr>
                 <w:r>
                   <w:t>TIME        :</w:t>
@@ -149,6 +163,9 @@
                 </w:tcBorders>
               </w:tcPr>
               <w:p>
+                <w:pPr>
+                  <w:spacing w:after="0" w:line="240" w:lineRule="auto"/>
+                </w:pPr>
                 <w:r>
                   <w:t>EXAM NO  :</w:t>
                 </w:r>
@@ -169,6 +186,7 @@
               <w:p>
                 <w:pPr>
                   <w:jc w:val="right"/>
+                  <w:spacing w:after="0" w:line="240" w:lineRule="auto"/>
                 </w:pPr>
                 <w:r>
                   <w:t>MARKS    :</w:t>
@@ -177,7 +195,14 @@
             </w:tc>
           </w:tr>
         </w:tbl>
-        <w:p/>
+        <w:p>
+          <w:pPr>
+            <w:spacing w:before="0" w:after="0" w:line="240" w:lineRule="auto"/>
+            <w:rPr>
+              <w:sz w:val="12"/>
+            </w:rPr>
+          </w:pPr>
+        </w:p>
       </w:tc>
     </w:tr>
   </w:tbl>

</xml_diff>